<commit_message>
docs: regenerate BCT Research Paper with fixed table alignment and layout
</commit_message>
<xml_diff>
--- a/BCT Research Paper.docx
+++ b/BCT Research Paper.docx
@@ -84,7 +84,7 @@
       <w:pPr>
         <w:spacing w:after="320"/>
         <w:ind w:firstLine="0"/>
-        <w:jc w:val="both"/>
+        <w:jc w:val="left"/>
       </w:pPr>
       <w:r>
         <w:rPr>
@@ -119,6 +119,7 @@
     </w:p>
     <w:p>
       <w:pPr>
+        <w:keepNext/>
         <w:spacing w:before="200" w:after="80"/>
         <w:ind w:firstLine="0"/>
         <w:jc w:val="left"/>
@@ -136,6 +137,7 @@
     </w:p>
     <w:p>
       <w:pPr>
+        <w:keepNext/>
         <w:spacing w:before="200" w:after="80"/>
         <w:ind w:firstLine="0"/>
         <w:jc w:val="left"/>
@@ -153,9 +155,10 @@
     </w:p>
     <w:p>
       <w:pPr>
-        <w:spacing w:after="120" w:line="240" w:lineRule="auto"/>
+        <w:keepNext w:val="0"/>
+        <w:spacing w:after="100" w:line="240" w:lineRule="auto"/>
         <w:ind w:firstLine="454"/>
-        <w:jc w:val="both"/>
+        <w:jc w:val="left"/>
       </w:pPr>
       <w:r>
         <w:rPr>
@@ -170,9 +173,10 @@
     </w:p>
     <w:p>
       <w:pPr>
-        <w:spacing w:after="120" w:line="240" w:lineRule="auto"/>
+        <w:keepNext w:val="0"/>
+        <w:spacing w:after="100" w:line="240" w:lineRule="auto"/>
         <w:ind w:firstLine="454"/>
-        <w:jc w:val="both"/>
+        <w:jc w:val="left"/>
       </w:pPr>
       <w:r>
         <w:rPr>
@@ -187,6 +191,7 @@
     </w:p>
     <w:p>
       <w:pPr>
+        <w:keepNext/>
         <w:spacing w:before="200" w:after="80"/>
         <w:ind w:firstLine="0"/>
         <w:jc w:val="left"/>
@@ -204,9 +209,10 @@
     </w:p>
     <w:p>
       <w:pPr>
-        <w:spacing w:after="120" w:line="240" w:lineRule="auto"/>
+        <w:keepNext w:val="0"/>
+        <w:spacing w:after="100" w:line="240" w:lineRule="auto"/>
         <w:ind w:firstLine="454"/>
-        <w:jc w:val="both"/>
+        <w:jc w:val="left"/>
       </w:pPr>
       <w:r>
         <w:rPr>
@@ -221,6 +227,7 @@
     </w:p>
     <w:p>
       <w:pPr>
+        <w:keepNext/>
         <w:spacing w:before="200" w:after="80"/>
         <w:ind w:firstLine="0"/>
         <w:jc w:val="left"/>
@@ -238,9 +245,10 @@
     </w:p>
     <w:p>
       <w:pPr>
-        <w:spacing w:after="120" w:line="240" w:lineRule="auto"/>
+        <w:keepNext w:val="0"/>
+        <w:spacing w:after="100" w:line="240" w:lineRule="auto"/>
         <w:ind w:firstLine="454"/>
-        <w:jc w:val="both"/>
+        <w:jc w:val="left"/>
       </w:pPr>
       <w:r>
         <w:rPr>
@@ -255,6 +263,7 @@
     </w:p>
     <w:p>
       <w:pPr>
+        <w:keepNext/>
         <w:spacing w:before="200" w:after="80"/>
         <w:ind w:firstLine="0"/>
         <w:jc w:val="left"/>
@@ -272,6 +281,7 @@
     </w:p>
     <w:p>
       <w:pPr>
+        <w:keepNext/>
         <w:spacing w:before="200" w:after="80"/>
         <w:ind w:firstLine="0"/>
         <w:jc w:val="left"/>
@@ -289,9 +299,10 @@
     </w:p>
     <w:p>
       <w:pPr>
-        <w:spacing w:after="120" w:line="240" w:lineRule="auto"/>
+        <w:keepNext w:val="0"/>
+        <w:spacing w:after="100" w:line="240" w:lineRule="auto"/>
         <w:ind w:firstLine="454"/>
-        <w:jc w:val="both"/>
+        <w:jc w:val="left"/>
       </w:pPr>
       <w:r>
         <w:rPr>
@@ -306,6 +317,7 @@
     </w:p>
     <w:p>
       <w:pPr>
+        <w:keepNext/>
         <w:spacing w:before="200" w:after="80"/>
         <w:ind w:firstLine="0"/>
         <w:jc w:val="left"/>
@@ -323,9 +335,10 @@
     </w:p>
     <w:p>
       <w:pPr>
-        <w:spacing w:after="120" w:line="240" w:lineRule="auto"/>
+        <w:keepNext w:val="0"/>
+        <w:spacing w:after="100" w:line="240" w:lineRule="auto"/>
         <w:ind w:firstLine="454"/>
-        <w:jc w:val="both"/>
+        <w:jc w:val="left"/>
       </w:pPr>
       <w:r>
         <w:rPr>
@@ -340,6 +353,7 @@
     </w:p>
     <w:p>
       <w:pPr>
+        <w:keepNext/>
         <w:spacing w:before="200" w:after="80"/>
         <w:ind w:firstLine="0"/>
         <w:jc w:val="left"/>
@@ -357,9 +371,10 @@
     </w:p>
     <w:p>
       <w:pPr>
-        <w:spacing w:after="120" w:line="240" w:lineRule="auto"/>
+        <w:keepNext w:val="0"/>
+        <w:spacing w:after="100" w:line="240" w:lineRule="auto"/>
         <w:ind w:firstLine="454"/>
-        <w:jc w:val="both"/>
+        <w:jc w:val="left"/>
       </w:pPr>
       <w:r>
         <w:rPr>
@@ -374,6 +389,7 @@
     </w:p>
     <w:p>
       <w:pPr>
+        <w:keepNext/>
         <w:spacing w:before="200" w:after="80"/>
         <w:ind w:firstLine="0"/>
         <w:jc w:val="left"/>
@@ -391,9 +407,10 @@
     </w:p>
     <w:p>
       <w:pPr>
-        <w:spacing w:after="120" w:line="240" w:lineRule="auto"/>
+        <w:keepNext w:val="0"/>
+        <w:spacing w:after="100" w:line="240" w:lineRule="auto"/>
         <w:ind w:firstLine="454"/>
-        <w:jc w:val="both"/>
+        <w:jc w:val="left"/>
       </w:pPr>
       <w:r>
         <w:rPr>
@@ -408,6 +425,7 @@
     </w:p>
     <w:p>
       <w:pPr>
+        <w:keepNext/>
         <w:spacing w:before="200" w:after="80"/>
         <w:ind w:firstLine="0"/>
         <w:jc w:val="left"/>
@@ -425,6 +443,7 @@
     </w:p>
     <w:p>
       <w:pPr>
+        <w:keepNext/>
         <w:spacing w:before="200" w:after="80"/>
         <w:ind w:firstLine="0"/>
         <w:jc w:val="left"/>
@@ -442,9 +461,10 @@
     </w:p>
     <w:p>
       <w:pPr>
-        <w:spacing w:after="120" w:line="240" w:lineRule="auto"/>
+        <w:keepNext w:val="0"/>
+        <w:spacing w:after="100" w:line="240" w:lineRule="auto"/>
         <w:ind w:firstLine="454"/>
-        <w:jc w:val="both"/>
+        <w:jc w:val="left"/>
       </w:pPr>
       <w:r>
         <w:rPr>
@@ -471,13 +491,7 @@
           <w:color w:val="000000"/>
           <w:sz w:val="16"/>
         </w:rPr>
-        <w:t>Client (Frontend)  &lt;--HTTPS--&gt;  Serverless Backend</w:t>
-        <w:br/>
-        <w:t>React 19, TypeScript             Service + Persistence</w:t>
-        <w:br/>
-        <w:t>Tailwind CSS                     Certificate Service</w:t>
-        <w:br/>
-        <w:t>Framer Motion                    SHA-256, Firestore, Auth</w:t>
+        <w:t>[Client: React 19, TypeScript, Tailwind] &lt;--HTTPS--&gt; [Backend: Firestore, Firebase Auth, SHA-256 Service]</w:t>
       </w:r>
     </w:p>
     <w:p>
@@ -494,11 +508,12 @@
           <w:color w:val="000000"/>
           <w:sz w:val="18"/>
         </w:rPr>
-        <w:t>Figure 1: CertifyChain Two-Tier Client-Server Architecture</w:t>
+        <w:t>Figure 1: Two-Tier Client-Server Architecture</w:t>
       </w:r>
     </w:p>
     <w:p>
       <w:pPr>
+        <w:keepNext/>
         <w:spacing w:before="200" w:after="80"/>
         <w:ind w:firstLine="0"/>
         <w:jc w:val="left"/>
@@ -516,6 +531,7 @@
     </w:p>
     <w:p>
       <w:pPr>
+        <w:keepNext/>
         <w:spacing w:before="200" w:after="80"/>
         <w:ind w:firstLine="0"/>
         <w:jc w:val="left"/>
@@ -533,9 +549,10 @@
     </w:p>
     <w:p>
       <w:pPr>
-        <w:spacing w:after="120" w:line="240" w:lineRule="auto"/>
+        <w:keepNext w:val="0"/>
+        <w:spacing w:after="100" w:line="240" w:lineRule="auto"/>
         <w:ind w:firstLine="454"/>
-        <w:jc w:val="both"/>
+        <w:jc w:val="left"/>
       </w:pPr>
       <w:r>
         <w:rPr>
@@ -548,12 +565,24 @@
         <w:t>Each certificate in the system is represented by a structured record containing exactly seven fields as shown in Table 1.</w:t>
       </w:r>
     </w:p>
+    <w:p>
+      <w:pPr>
+        <w:sectPr>
+          <w:type w:val="continuous"/>
+          <w:pgSz w:w="11906" w:h="16838"/>
+          <w:pgMar w:top="1417" w:right="1134" w:bottom="1417" w:left="1134" w:header="720" w:footer="720" w:gutter="0"/>
+          <w:cols w:space="720" w:num="2"/>
+          <w:docGrid w:linePitch="360"/>
+        </w:sectPr>
+      </w:pPr>
+    </w:p>
     <w:tbl>
       <w:tblPr>
         <w:tblW w:type="auto" w:w="0"/>
         <w:jc w:val="center"/>
         <w:tblLayout w:type="fixed"/>
         <w:tblLook w:firstColumn="1" w:firstRow="1" w:lastColumn="0" w:lastRow="0" w:noHBand="0" w:noVBand="1" w:val="04A0"/>
+        <w:tblW w:w="5000" w:type="pct"/>
       </w:tblPr>
       <w:tblGrid>
         <w:gridCol w:w="3213"/>
@@ -575,7 +604,7 @@
                 <w:b/>
                 <w:i w:val="0"/>
                 <w:color w:val="000000"/>
-                <w:sz w:val="18"/>
+                <w:sz w:val="16"/>
               </w:rPr>
               <w:t>Field</w:t>
             </w:r>
@@ -595,7 +624,7 @@
                 <w:b/>
                 <w:i w:val="0"/>
                 <w:color w:val="000000"/>
-                <w:sz w:val="18"/>
+                <w:sz w:val="16"/>
               </w:rPr>
               <w:t>Type</w:t>
             </w:r>
@@ -615,7 +644,7 @@
                 <w:b/>
                 <w:i w:val="0"/>
                 <w:color w:val="000000"/>
-                <w:sz w:val="18"/>
+                <w:sz w:val="16"/>
               </w:rPr>
               <w:t>Description</w:t>
             </w:r>
@@ -637,7 +666,7 @@
                 <w:b w:val="0"/>
                 <w:i w:val="0"/>
                 <w:color w:val="000000"/>
-                <w:sz w:val="18"/>
+                <w:sz w:val="16"/>
               </w:rPr>
               <w:t>recipientName</w:t>
             </w:r>
@@ -657,7 +686,7 @@
                 <w:b w:val="0"/>
                 <w:i w:val="0"/>
                 <w:color w:val="000000"/>
-                <w:sz w:val="18"/>
+                <w:sz w:val="16"/>
               </w:rPr>
               <w:t>string</w:t>
             </w:r>
@@ -677,7 +706,7 @@
                 <w:b w:val="0"/>
                 <w:i w:val="0"/>
                 <w:color w:val="000000"/>
-                <w:sz w:val="18"/>
+                <w:sz w:val="16"/>
               </w:rPr>
               <w:t>Name of the credential holder</w:t>
             </w:r>
@@ -699,7 +728,7 @@
                 <w:b w:val="0"/>
                 <w:i w:val="0"/>
                 <w:color w:val="000000"/>
-                <w:sz w:val="18"/>
+                <w:sz w:val="16"/>
               </w:rPr>
               <w:t>courseName</w:t>
             </w:r>
@@ -719,7 +748,7 @@
                 <w:b w:val="0"/>
                 <w:i w:val="0"/>
                 <w:color w:val="000000"/>
-                <w:sz w:val="18"/>
+                <w:sz w:val="16"/>
               </w:rPr>
               <w:t>string</w:t>
             </w:r>
@@ -739,7 +768,7 @@
                 <w:b w:val="0"/>
                 <w:i w:val="0"/>
                 <w:color w:val="000000"/>
-                <w:sz w:val="18"/>
+                <w:sz w:val="16"/>
               </w:rPr>
               <w:t>Title of the course or award</w:t>
             </w:r>
@@ -761,7 +790,7 @@
                 <w:b w:val="0"/>
                 <w:i w:val="0"/>
                 <w:color w:val="000000"/>
-                <w:sz w:val="18"/>
+                <w:sz w:val="16"/>
               </w:rPr>
               <w:t>issuerName</w:t>
             </w:r>
@@ -781,7 +810,7 @@
                 <w:b w:val="0"/>
                 <w:i w:val="0"/>
                 <w:color w:val="000000"/>
-                <w:sz w:val="18"/>
+                <w:sz w:val="16"/>
               </w:rPr>
               <w:t>string</w:t>
             </w:r>
@@ -801,7 +830,7 @@
                 <w:b w:val="0"/>
                 <w:i w:val="0"/>
                 <w:color w:val="000000"/>
-                <w:sz w:val="18"/>
+                <w:sz w:val="16"/>
               </w:rPr>
               <w:t>Name of the issuing authority</w:t>
             </w:r>
@@ -823,7 +852,7 @@
                 <w:b w:val="0"/>
                 <w:i w:val="0"/>
                 <w:color w:val="000000"/>
-                <w:sz w:val="18"/>
+                <w:sz w:val="16"/>
               </w:rPr>
               <w:t>issueDate</w:t>
             </w:r>
@@ -843,7 +872,7 @@
                 <w:b w:val="0"/>
                 <w:i w:val="0"/>
                 <w:color w:val="000000"/>
-                <w:sz w:val="18"/>
+                <w:sz w:val="16"/>
               </w:rPr>
               <w:t>string</w:t>
             </w:r>
@@ -863,7 +892,7 @@
                 <w:b w:val="0"/>
                 <w:i w:val="0"/>
                 <w:color w:val="000000"/>
-                <w:sz w:val="18"/>
+                <w:sz w:val="16"/>
               </w:rPr>
               <w:t>Date of issuance (ISO 8601)</w:t>
             </w:r>
@@ -885,7 +914,7 @@
                 <w:b w:val="0"/>
                 <w:i w:val="0"/>
                 <w:color w:val="000000"/>
-                <w:sz w:val="18"/>
+                <w:sz w:val="16"/>
               </w:rPr>
               <w:t>dataHash</w:t>
             </w:r>
@@ -905,7 +934,7 @@
                 <w:b w:val="0"/>
                 <w:i w:val="0"/>
                 <w:color w:val="000000"/>
-                <w:sz w:val="18"/>
+                <w:sz w:val="16"/>
               </w:rPr>
               <w:t>string</w:t>
             </w:r>
@@ -925,7 +954,7 @@
                 <w:b w:val="0"/>
                 <w:i w:val="0"/>
                 <w:color w:val="000000"/>
-                <w:sz w:val="18"/>
+                <w:sz w:val="16"/>
               </w:rPr>
               <w:t>SHA-256 hash (64 hex chars)</w:t>
             </w:r>
@@ -947,7 +976,7 @@
                 <w:b w:val="0"/>
                 <w:i w:val="0"/>
                 <w:color w:val="000000"/>
-                <w:sz w:val="18"/>
+                <w:sz w:val="16"/>
               </w:rPr>
               <w:t>prevHash</w:t>
             </w:r>
@@ -967,7 +996,7 @@
                 <w:b w:val="0"/>
                 <w:i w:val="0"/>
                 <w:color w:val="000000"/>
-                <w:sz w:val="18"/>
+                <w:sz w:val="16"/>
               </w:rPr>
               <w:t>string</w:t>
             </w:r>
@@ -987,7 +1016,7 @@
                 <w:b w:val="0"/>
                 <w:i w:val="0"/>
                 <w:color w:val="000000"/>
-                <w:sz w:val="18"/>
+                <w:sz w:val="16"/>
               </w:rPr>
               <w:t>Previous certificate hash (64 hex)</w:t>
             </w:r>
@@ -1009,7 +1038,7 @@
                 <w:b w:val="0"/>
                 <w:i w:val="0"/>
                 <w:color w:val="000000"/>
-                <w:sz w:val="18"/>
+                <w:sz w:val="16"/>
               </w:rPr>
               <w:t>timestamp</w:t>
             </w:r>
@@ -1029,7 +1058,7 @@
                 <w:b w:val="0"/>
                 <w:i w:val="0"/>
                 <w:color w:val="000000"/>
-                <w:sz w:val="18"/>
+                <w:sz w:val="16"/>
               </w:rPr>
               <w:t>number</w:t>
             </w:r>
@@ -1049,7 +1078,7 @@
                 <w:b w:val="0"/>
                 <w:i w:val="0"/>
                 <w:color w:val="000000"/>
-                <w:sz w:val="18"/>
+                <w:sz w:val="16"/>
               </w:rPr>
               <w:t>Unix timestamp of creation</w:t>
             </w:r>
@@ -1059,7 +1088,7 @@
     </w:tbl>
     <w:p>
       <w:pPr>
-        <w:spacing w:after="160"/>
+        <w:spacing w:after="200"/>
         <w:ind w:firstLine="0"/>
         <w:jc w:val="center"/>
       </w:pPr>
@@ -1076,9 +1105,21 @@
     </w:p>
     <w:p>
       <w:pPr>
-        <w:spacing w:after="120" w:line="240" w:lineRule="auto"/>
+        <w:sectPr>
+          <w:type w:val="continuous"/>
+          <w:pgSz w:w="11906" w:h="16838"/>
+          <w:pgMar w:top="1417" w:right="1134" w:bottom="1417" w:left="1134" w:header="720" w:footer="720" w:gutter="0"/>
+          <w:cols w:space="720" w:num="1"/>
+          <w:docGrid w:linePitch="360"/>
+        </w:sectPr>
+      </w:pPr>
+    </w:p>
+    <w:p>
+      <w:pPr>
+        <w:keepNext w:val="0"/>
+        <w:spacing w:after="100" w:line="240" w:lineRule="auto"/>
         <w:ind w:firstLine="454"/>
-        <w:jc w:val="both"/>
+        <w:jc w:val="left"/>
       </w:pPr>
       <w:r>
         <w:rPr>
@@ -1093,6 +1134,7 @@
     </w:p>
     <w:p>
       <w:pPr>
+        <w:keepNext/>
         <w:spacing w:before="200" w:after="80"/>
         <w:ind w:firstLine="0"/>
         <w:jc w:val="left"/>
@@ -1110,9 +1152,10 @@
     </w:p>
     <w:p>
       <w:pPr>
-        <w:spacing w:after="120" w:line="240" w:lineRule="auto"/>
+        <w:keepNext w:val="0"/>
+        <w:spacing w:after="100" w:line="240" w:lineRule="auto"/>
         <w:ind w:firstLine="454"/>
-        <w:jc w:val="both"/>
+        <w:jc w:val="left"/>
       </w:pPr>
       <w:r>
         <w:rPr>
@@ -1127,6 +1170,7 @@
     </w:p>
     <w:p>
       <w:pPr>
+        <w:keepNext/>
         <w:spacing w:before="200" w:after="80"/>
         <w:ind w:firstLine="0"/>
         <w:jc w:val="left"/>
@@ -1144,9 +1188,10 @@
     </w:p>
     <w:p>
       <w:pPr>
-        <w:spacing w:after="120" w:line="240" w:lineRule="auto"/>
+        <w:keepNext w:val="0"/>
+        <w:spacing w:after="100" w:line="240" w:lineRule="auto"/>
         <w:ind w:firstLine="454"/>
-        <w:jc w:val="both"/>
+        <w:jc w:val="left"/>
       </w:pPr>
       <w:r>
         <w:rPr>
@@ -1161,6 +1206,7 @@
     </w:p>
     <w:p>
       <w:pPr>
+        <w:keepNext/>
         <w:spacing w:before="200" w:after="80"/>
         <w:ind w:firstLine="0"/>
         <w:jc w:val="left"/>
@@ -1178,6 +1224,7 @@
     </w:p>
     <w:p>
       <w:pPr>
+        <w:keepNext/>
         <w:spacing w:before="200" w:after="80"/>
         <w:ind w:firstLine="0"/>
         <w:jc w:val="left"/>
@@ -1195,9 +1242,10 @@
     </w:p>
     <w:p>
       <w:pPr>
-        <w:spacing w:after="120" w:line="240" w:lineRule="auto"/>
+        <w:keepNext w:val="0"/>
+        <w:spacing w:after="100" w:line="240" w:lineRule="auto"/>
         <w:ind w:firstLine="454"/>
-        <w:jc w:val="both"/>
+        <w:jc w:val="left"/>
       </w:pPr>
       <w:r>
         <w:rPr>
@@ -1212,6 +1260,7 @@
     </w:p>
     <w:p>
       <w:pPr>
+        <w:keepNext/>
         <w:spacing w:before="200" w:after="80"/>
         <w:ind w:firstLine="0"/>
         <w:jc w:val="left"/>
@@ -1229,9 +1278,10 @@
     </w:p>
     <w:p>
       <w:pPr>
-        <w:spacing w:after="120" w:line="240" w:lineRule="auto"/>
+        <w:keepNext w:val="0"/>
+        <w:spacing w:after="100" w:line="240" w:lineRule="auto"/>
         <w:ind w:firstLine="454"/>
-        <w:jc w:val="both"/>
+        <w:jc w:val="left"/>
       </w:pPr>
       <w:r>
         <w:rPr>
@@ -1244,12 +1294,24 @@
         <w:t>Table 2 summarizes the defense mechanisms mapped to each threat.</w:t>
       </w:r>
     </w:p>
+    <w:p>
+      <w:pPr>
+        <w:sectPr>
+          <w:type w:val="continuous"/>
+          <w:pgSz w:w="11906" w:h="16838"/>
+          <w:pgMar w:top="1417" w:right="1134" w:bottom="1417" w:left="1134" w:header="720" w:footer="720" w:gutter="0"/>
+          <w:cols w:space="720" w:num="2"/>
+          <w:docGrid w:linePitch="360"/>
+        </w:sectPr>
+      </w:pPr>
+    </w:p>
     <w:tbl>
       <w:tblPr>
         <w:tblW w:type="auto" w:w="0"/>
         <w:jc w:val="center"/>
         <w:tblLayout w:type="fixed"/>
         <w:tblLook w:firstColumn="1" w:firstRow="1" w:lastColumn="0" w:lastRow="0" w:noHBand="0" w:noVBand="1" w:val="04A0"/>
+        <w:tblW w:w="5000" w:type="pct"/>
       </w:tblPr>
       <w:tblGrid>
         <w:gridCol w:w="4819"/>
@@ -1270,7 +1332,7 @@
                 <w:b/>
                 <w:i w:val="0"/>
                 <w:color w:val="000000"/>
-                <w:sz w:val="18"/>
+                <w:sz w:val="16"/>
               </w:rPr>
               <w:t>Threat</w:t>
             </w:r>
@@ -1290,7 +1352,7 @@
                 <w:b/>
                 <w:i w:val="0"/>
                 <w:color w:val="000000"/>
-                <w:sz w:val="18"/>
+                <w:sz w:val="16"/>
               </w:rPr>
               <w:t>Defense Mechanism</w:t>
             </w:r>
@@ -1312,7 +1374,7 @@
                 <w:b w:val="0"/>
                 <w:i w:val="0"/>
                 <w:color w:val="000000"/>
-                <w:sz w:val="18"/>
+                <w:sz w:val="16"/>
               </w:rPr>
               <w:t>T1</w:t>
             </w:r>
@@ -1332,7 +1394,7 @@
                 <w:b w:val="0"/>
                 <w:i w:val="0"/>
                 <w:color w:val="000000"/>
-                <w:sz w:val="18"/>
+                <w:sz w:val="16"/>
               </w:rPr>
               <w:t>Hash chaining + Firestore immutability rules</w:t>
             </w:r>
@@ -1354,7 +1416,7 @@
                 <w:b w:val="0"/>
                 <w:i w:val="0"/>
                 <w:color w:val="000000"/>
-                <w:sz w:val="18"/>
+                <w:sz w:val="16"/>
               </w:rPr>
               <w:t>T2</w:t>
             </w:r>
@@ -1374,7 +1436,7 @@
                 <w:b w:val="0"/>
                 <w:i w:val="0"/>
                 <w:color w:val="000000"/>
-                <w:sz w:val="18"/>
+                <w:sz w:val="16"/>
               </w:rPr>
               <w:t>Firebase Auth + Admin email validation</w:t>
             </w:r>
@@ -1396,7 +1458,7 @@
                 <w:b w:val="0"/>
                 <w:i w:val="0"/>
                 <w:color w:val="000000"/>
-                <w:sz w:val="18"/>
+                <w:sz w:val="16"/>
               </w:rPr>
               <w:t>T3</w:t>
             </w:r>
@@ -1416,7 +1478,7 @@
                 <w:b w:val="0"/>
                 <w:i w:val="0"/>
                 <w:color w:val="000000"/>
-                <w:sz w:val="18"/>
+                <w:sz w:val="16"/>
               </w:rPr>
               <w:t>Firestore rules deny all update/delete ops</w:t>
             </w:r>
@@ -1438,7 +1500,7 @@
                 <w:b w:val="0"/>
                 <w:i w:val="0"/>
                 <w:color w:val="000000"/>
-                <w:sz w:val="18"/>
+                <w:sz w:val="16"/>
               </w:rPr>
               <w:t>T4</w:t>
             </w:r>
@@ -1458,7 +1520,7 @@
                 <w:b w:val="0"/>
                 <w:i w:val="0"/>
                 <w:color w:val="000000"/>
-                <w:sz w:val="18"/>
+                <w:sz w:val="16"/>
               </w:rPr>
               <w:t>HTTPS transport + server-side security rules</w:t>
             </w:r>
@@ -1468,7 +1530,7 @@
     </w:tbl>
     <w:p>
       <w:pPr>
-        <w:spacing w:after="160"/>
+        <w:spacing w:after="200"/>
         <w:ind w:firstLine="0"/>
         <w:jc w:val="center"/>
       </w:pPr>
@@ -1485,6 +1547,18 @@
     </w:p>
     <w:p>
       <w:pPr>
+        <w:sectPr>
+          <w:type w:val="continuous"/>
+          <w:pgSz w:w="11906" w:h="16838"/>
+          <w:pgMar w:top="1417" w:right="1134" w:bottom="1417" w:left="1134" w:header="720" w:footer="720" w:gutter="0"/>
+          <w:cols w:space="720" w:num="1"/>
+          <w:docGrid w:linePitch="360"/>
+        </w:sectPr>
+      </w:pPr>
+    </w:p>
+    <w:p>
+      <w:pPr>
+        <w:keepNext/>
         <w:spacing w:before="200" w:after="80"/>
         <w:ind w:firstLine="0"/>
         <w:jc w:val="left"/>
@@ -1502,6 +1576,7 @@
     </w:p>
     <w:p>
       <w:pPr>
+        <w:keepNext/>
         <w:spacing w:before="200" w:after="80"/>
         <w:ind w:firstLine="0"/>
         <w:jc w:val="left"/>
@@ -1519,9 +1594,10 @@
     </w:p>
     <w:p>
       <w:pPr>
-        <w:spacing w:after="120" w:line="240" w:lineRule="auto"/>
+        <w:keepNext w:val="0"/>
+        <w:spacing w:after="100" w:line="240" w:lineRule="auto"/>
         <w:ind w:firstLine="454"/>
-        <w:jc w:val="both"/>
+        <w:jc w:val="left"/>
       </w:pPr>
       <w:r>
         <w:rPr>
@@ -1536,6 +1612,7 @@
     </w:p>
     <w:p>
       <w:pPr>
+        <w:keepNext/>
         <w:spacing w:before="200" w:after="80"/>
         <w:ind w:firstLine="0"/>
         <w:jc w:val="left"/>
@@ -1553,9 +1630,10 @@
     </w:p>
     <w:p>
       <w:pPr>
-        <w:spacing w:after="120" w:line="240" w:lineRule="auto"/>
+        <w:keepNext w:val="0"/>
+        <w:spacing w:after="100" w:line="240" w:lineRule="auto"/>
         <w:ind w:firstLine="454"/>
-        <w:jc w:val="both"/>
+        <w:jc w:val="left"/>
       </w:pPr>
       <w:r>
         <w:rPr>
@@ -1570,6 +1648,7 @@
     </w:p>
     <w:p>
       <w:pPr>
+        <w:keepNext/>
         <w:spacing w:before="200" w:after="80"/>
         <w:ind w:firstLine="0"/>
         <w:jc w:val="left"/>
@@ -1587,9 +1666,10 @@
     </w:p>
     <w:p>
       <w:pPr>
-        <w:spacing w:after="120" w:line="240" w:lineRule="auto"/>
+        <w:keepNext w:val="0"/>
+        <w:spacing w:after="100" w:line="240" w:lineRule="auto"/>
         <w:ind w:firstLine="454"/>
-        <w:jc w:val="both"/>
+        <w:jc w:val="left"/>
       </w:pPr>
       <w:r>
         <w:rPr>
@@ -1604,6 +1684,7 @@
     </w:p>
     <w:p>
       <w:pPr>
+        <w:keepNext/>
         <w:spacing w:before="200" w:after="80"/>
         <w:ind w:firstLine="0"/>
         <w:jc w:val="left"/>
@@ -1621,6 +1702,7 @@
     </w:p>
     <w:p>
       <w:pPr>
+        <w:keepNext/>
         <w:spacing w:before="200" w:after="80"/>
         <w:ind w:firstLine="0"/>
         <w:jc w:val="left"/>
@@ -1638,9 +1720,10 @@
     </w:p>
     <w:p>
       <w:pPr>
-        <w:spacing w:after="120" w:line="240" w:lineRule="auto"/>
+        <w:keepNext w:val="0"/>
+        <w:spacing w:after="100" w:line="240" w:lineRule="auto"/>
         <w:ind w:firstLine="454"/>
-        <w:jc w:val="both"/>
+        <w:jc w:val="left"/>
       </w:pPr>
       <w:r>
         <w:rPr>
@@ -1655,6 +1738,7 @@
     </w:p>
     <w:p>
       <w:pPr>
+        <w:keepNext/>
         <w:spacing w:before="200" w:after="80"/>
         <w:ind w:firstLine="0"/>
         <w:jc w:val="left"/>
@@ -1672,9 +1756,10 @@
     </w:p>
     <w:p>
       <w:pPr>
-        <w:spacing w:after="120" w:line="240" w:lineRule="auto"/>
+        <w:keepNext w:val="0"/>
+        <w:spacing w:after="100" w:line="240" w:lineRule="auto"/>
         <w:ind w:firstLine="454"/>
-        <w:jc w:val="both"/>
+        <w:jc w:val="left"/>
       </w:pPr>
       <w:r>
         <w:rPr>
@@ -1689,6 +1774,7 @@
     </w:p>
     <w:p>
       <w:pPr>
+        <w:keepNext/>
         <w:spacing w:before="200" w:after="80"/>
         <w:ind w:firstLine="0"/>
         <w:jc w:val="left"/>
@@ -1706,9 +1792,10 @@
     </w:p>
     <w:p>
       <w:pPr>
-        <w:spacing w:after="120" w:line="240" w:lineRule="auto"/>
+        <w:keepNext w:val="0"/>
+        <w:spacing w:after="100" w:line="240" w:lineRule="auto"/>
         <w:ind w:firstLine="454"/>
-        <w:jc w:val="both"/>
+        <w:jc w:val="left"/>
       </w:pPr>
       <w:r>
         <w:rPr>
@@ -1723,6 +1810,7 @@
     </w:p>
     <w:p>
       <w:pPr>
+        <w:keepNext/>
         <w:spacing w:before="200" w:after="80"/>
         <w:ind w:firstLine="0"/>
         <w:jc w:val="left"/>
@@ -1740,9 +1828,10 @@
     </w:p>
     <w:p>
       <w:pPr>
-        <w:spacing w:after="120" w:line="240" w:lineRule="auto"/>
+        <w:keepNext w:val="0"/>
+        <w:spacing w:after="100" w:line="240" w:lineRule="auto"/>
         <w:ind w:firstLine="454"/>
-        <w:jc w:val="both"/>
+        <w:jc w:val="left"/>
       </w:pPr>
       <w:r>
         <w:rPr>
@@ -1757,6 +1846,7 @@
     </w:p>
     <w:p>
       <w:pPr>
+        <w:keepNext/>
         <w:spacing w:before="200" w:after="80"/>
         <w:ind w:firstLine="0"/>
         <w:jc w:val="left"/>
@@ -1774,6 +1864,7 @@
     </w:p>
     <w:p>
       <w:pPr>
+        <w:keepNext/>
         <w:spacing w:before="200" w:after="80"/>
         <w:ind w:firstLine="0"/>
         <w:jc w:val="left"/>
@@ -1791,9 +1882,10 @@
     </w:p>
     <w:p>
       <w:pPr>
-        <w:spacing w:after="120" w:line="240" w:lineRule="auto"/>
+        <w:keepNext w:val="0"/>
+        <w:spacing w:after="100" w:line="240" w:lineRule="auto"/>
         <w:ind w:firstLine="454"/>
-        <w:jc w:val="both"/>
+        <w:jc w:val="left"/>
       </w:pPr>
       <w:r>
         <w:rPr>
@@ -1806,12 +1898,24 @@
         <w:t>CertifyChain was validated through a comprehensive test suite covering normal operations, edge cases, and security scenarios as summarized in Table 3.</w:t>
       </w:r>
     </w:p>
+    <w:p>
+      <w:pPr>
+        <w:sectPr>
+          <w:type w:val="continuous"/>
+          <w:pgSz w:w="11906" w:h="16838"/>
+          <w:pgMar w:top="1417" w:right="1134" w:bottom="1417" w:left="1134" w:header="720" w:footer="720" w:gutter="0"/>
+          <w:cols w:space="720" w:num="2"/>
+          <w:docGrid w:linePitch="360"/>
+        </w:sectPr>
+      </w:pPr>
+    </w:p>
     <w:tbl>
       <w:tblPr>
         <w:tblW w:type="auto" w:w="0"/>
         <w:jc w:val="center"/>
         <w:tblLayout w:type="fixed"/>
         <w:tblLook w:firstColumn="1" w:firstRow="1" w:lastColumn="0" w:lastRow="0" w:noHBand="0" w:noVBand="1" w:val="04A0"/>
+        <w:tblW w:w="5000" w:type="pct"/>
       </w:tblPr>
       <w:tblGrid>
         <w:gridCol w:w="3213"/>
@@ -1833,7 +1937,7 @@
                 <w:b/>
                 <w:i w:val="0"/>
                 <w:color w:val="000000"/>
-                <w:sz w:val="18"/>
+                <w:sz w:val="16"/>
               </w:rPr>
               <w:t>Test Case</w:t>
             </w:r>
@@ -1853,7 +1957,7 @@
                 <w:b/>
                 <w:i w:val="0"/>
                 <w:color w:val="000000"/>
-                <w:sz w:val="18"/>
+                <w:sz w:val="16"/>
               </w:rPr>
               <w:t>Expected Result</w:t>
             </w:r>
@@ -1873,7 +1977,7 @@
                 <w:b/>
                 <w:i w:val="0"/>
                 <w:color w:val="000000"/>
-                <w:sz w:val="18"/>
+                <w:sz w:val="16"/>
               </w:rPr>
               <w:t>Status</w:t>
             </w:r>
@@ -1895,7 +1999,7 @@
                 <w:b w:val="0"/>
                 <w:i w:val="0"/>
                 <w:color w:val="000000"/>
-                <w:sz w:val="18"/>
+                <w:sz w:val="16"/>
               </w:rPr>
               <w:t>Issue certificate as admin</w:t>
             </w:r>
@@ -1915,7 +2019,7 @@
                 <w:b w:val="0"/>
                 <w:i w:val="0"/>
                 <w:color w:val="000000"/>
-                <w:sz w:val="18"/>
+                <w:sz w:val="16"/>
               </w:rPr>
               <w:t>Record created with valid hash</w:t>
             </w:r>
@@ -1935,7 +2039,7 @@
                 <w:b w:val="0"/>
                 <w:i w:val="0"/>
                 <w:color w:val="000000"/>
-                <w:sz w:val="18"/>
+                <w:sz w:val="16"/>
               </w:rPr>
               <w:t>Pass</w:t>
             </w:r>
@@ -1957,7 +2061,7 @@
                 <w:b w:val="0"/>
                 <w:i w:val="0"/>
                 <w:color w:val="000000"/>
-                <w:sz w:val="18"/>
+                <w:sz w:val="16"/>
               </w:rPr>
               <w:t>Verify existing certificate</w:t>
             </w:r>
@@ -1977,7 +2081,7 @@
                 <w:b w:val="0"/>
                 <w:i w:val="0"/>
                 <w:color w:val="000000"/>
-                <w:sz w:val="18"/>
+                <w:sz w:val="16"/>
               </w:rPr>
               <w:t>Authentic status displayed</w:t>
             </w:r>
@@ -1997,7 +2101,7 @@
                 <w:b w:val="0"/>
                 <w:i w:val="0"/>
                 <w:color w:val="000000"/>
-                <w:sz w:val="18"/>
+                <w:sz w:val="16"/>
               </w:rPr>
               <w:t>Pass</w:t>
             </w:r>
@@ -2019,7 +2123,7 @@
                 <w:b w:val="0"/>
                 <w:i w:val="0"/>
                 <w:color w:val="000000"/>
-                <w:sz w:val="18"/>
+                <w:sz w:val="16"/>
               </w:rPr>
               <w:t>Verify non-existent ID</w:t>
             </w:r>
@@ -2039,7 +2143,7 @@
                 <w:b w:val="0"/>
                 <w:i w:val="0"/>
                 <w:color w:val="000000"/>
-                <w:sz w:val="18"/>
+                <w:sz w:val="16"/>
               </w:rPr>
               <w:t>Not found error displayed</w:t>
             </w:r>
@@ -2059,7 +2163,7 @@
                 <w:b w:val="0"/>
                 <w:i w:val="0"/>
                 <w:color w:val="000000"/>
-                <w:sz w:val="18"/>
+                <w:sz w:val="16"/>
               </w:rPr>
               <w:t>Pass</w:t>
             </w:r>
@@ -2081,7 +2185,7 @@
                 <w:b w:val="0"/>
                 <w:i w:val="0"/>
                 <w:color w:val="000000"/>
-                <w:sz w:val="18"/>
+                <w:sz w:val="16"/>
               </w:rPr>
               <w:t>Access issue panel w/o login</w:t>
             </w:r>
@@ -2101,7 +2205,7 @@
                 <w:b w:val="0"/>
                 <w:i w:val="0"/>
                 <w:color w:val="000000"/>
-                <w:sz w:val="18"/>
+                <w:sz w:val="16"/>
               </w:rPr>
               <w:t>Login gate displayed</w:t>
             </w:r>
@@ -2121,7 +2225,7 @@
                 <w:b w:val="0"/>
                 <w:i w:val="0"/>
                 <w:color w:val="000000"/>
-                <w:sz w:val="18"/>
+                <w:sz w:val="16"/>
               </w:rPr>
               <w:t>Pass</w:t>
             </w:r>
@@ -2143,7 +2247,7 @@
                 <w:b w:val="0"/>
                 <w:i w:val="0"/>
                 <w:color w:val="000000"/>
-                <w:sz w:val="18"/>
+                <w:sz w:val="16"/>
               </w:rPr>
               <w:t>View ledger explorer</w:t>
             </w:r>
@@ -2163,7 +2267,7 @@
                 <w:b w:val="0"/>
                 <w:i w:val="0"/>
                 <w:color w:val="000000"/>
-                <w:sz w:val="18"/>
+                <w:sz w:val="16"/>
               </w:rPr>
               <w:t>All certificates rendered</w:t>
             </w:r>
@@ -2183,7 +2287,7 @@
                 <w:b w:val="0"/>
                 <w:i w:val="0"/>
                 <w:color w:val="000000"/>
-                <w:sz w:val="18"/>
+                <w:sz w:val="16"/>
               </w:rPr>
               <w:t>Pass</w:t>
             </w:r>
@@ -2205,7 +2309,7 @@
                 <w:b w:val="0"/>
                 <w:i w:val="0"/>
                 <w:color w:val="000000"/>
-                <w:sz w:val="18"/>
+                <w:sz w:val="16"/>
               </w:rPr>
               <w:t>Copy certificate ID</w:t>
             </w:r>
@@ -2225,7 +2329,7 @@
                 <w:b w:val="0"/>
                 <w:i w:val="0"/>
                 <w:color w:val="000000"/>
-                <w:sz w:val="18"/>
+                <w:sz w:val="16"/>
               </w:rPr>
               <w:t>Clipboard contains ID</w:t>
             </w:r>
@@ -2245,7 +2349,7 @@
                 <w:b w:val="0"/>
                 <w:i w:val="0"/>
                 <w:color w:val="000000"/>
-                <w:sz w:val="18"/>
+                <w:sz w:val="16"/>
               </w:rPr>
               <w:t>Pass</w:t>
             </w:r>
@@ -2255,7 +2359,7 @@
     </w:tbl>
     <w:p>
       <w:pPr>
-        <w:spacing w:after="160"/>
+        <w:spacing w:after="200"/>
         <w:ind w:firstLine="0"/>
         <w:jc w:val="center"/>
       </w:pPr>
@@ -2272,6 +2376,18 @@
     </w:p>
     <w:p>
       <w:pPr>
+        <w:sectPr>
+          <w:type w:val="continuous"/>
+          <w:pgSz w:w="11906" w:h="16838"/>
+          <w:pgMar w:top="1417" w:right="1134" w:bottom="1417" w:left="1134" w:header="720" w:footer="720" w:gutter="0"/>
+          <w:cols w:space="720" w:num="1"/>
+          <w:docGrid w:linePitch="360"/>
+        </w:sectPr>
+      </w:pPr>
+    </w:p>
+    <w:p>
+      <w:pPr>
+        <w:keepNext/>
         <w:spacing w:before="200" w:after="80"/>
         <w:ind w:firstLine="0"/>
         <w:jc w:val="left"/>
@@ -2289,9 +2405,10 @@
     </w:p>
     <w:p>
       <w:pPr>
-        <w:spacing w:after="120" w:line="240" w:lineRule="auto"/>
+        <w:keepNext w:val="0"/>
+        <w:spacing w:after="100" w:line="240" w:lineRule="auto"/>
         <w:ind w:firstLine="454"/>
-        <w:jc w:val="both"/>
+        <w:jc w:val="left"/>
       </w:pPr>
       <w:r>
         <w:rPr>
@@ -2306,6 +2423,7 @@
     </w:p>
     <w:p>
       <w:pPr>
+        <w:keepNext/>
         <w:spacing w:before="200" w:after="80"/>
         <w:ind w:firstLine="0"/>
         <w:jc w:val="left"/>
@@ -2323,9 +2441,10 @@
     </w:p>
     <w:p>
       <w:pPr>
-        <w:spacing w:after="120" w:line="240" w:lineRule="auto"/>
+        <w:keepNext w:val="0"/>
+        <w:spacing w:after="100" w:line="240" w:lineRule="auto"/>
         <w:ind w:firstLine="454"/>
-        <w:jc w:val="both"/>
+        <w:jc w:val="left"/>
       </w:pPr>
       <w:r>
         <w:rPr>
@@ -2338,12 +2457,24 @@
         <w:t>Table 4 presents a feature comparison between CertifyChain, Blockcerts, and traditional database solutions.</w:t>
       </w:r>
     </w:p>
+    <w:p>
+      <w:pPr>
+        <w:sectPr>
+          <w:type w:val="continuous"/>
+          <w:pgSz w:w="11906" w:h="16838"/>
+          <w:pgMar w:top="1417" w:right="1134" w:bottom="1417" w:left="1134" w:header="720" w:footer="720" w:gutter="0"/>
+          <w:cols w:space="720" w:num="2"/>
+          <w:docGrid w:linePitch="360"/>
+        </w:sectPr>
+      </w:pPr>
+    </w:p>
     <w:tbl>
       <w:tblPr>
         <w:tblW w:type="auto" w:w="0"/>
         <w:jc w:val="center"/>
         <w:tblLayout w:type="fixed"/>
         <w:tblLook w:firstColumn="1" w:firstRow="1" w:lastColumn="0" w:lastRow="0" w:noHBand="0" w:noVBand="1" w:val="04A0"/>
+        <w:tblW w:w="5000" w:type="pct"/>
       </w:tblPr>
       <w:tblGrid>
         <w:gridCol w:w="2409"/>
@@ -2366,7 +2497,7 @@
                 <w:b/>
                 <w:i w:val="0"/>
                 <w:color w:val="000000"/>
-                <w:sz w:val="18"/>
+                <w:sz w:val="16"/>
               </w:rPr>
               <w:t>Feature</w:t>
             </w:r>
@@ -2386,7 +2517,7 @@
                 <w:b/>
                 <w:i w:val="0"/>
                 <w:color w:val="000000"/>
-                <w:sz w:val="18"/>
+                <w:sz w:val="16"/>
               </w:rPr>
               <w:t>CertifyChain</w:t>
             </w:r>
@@ -2406,7 +2537,7 @@
                 <w:b/>
                 <w:i w:val="0"/>
                 <w:color w:val="000000"/>
-                <w:sz w:val="18"/>
+                <w:sz w:val="16"/>
               </w:rPr>
               <w:t>Blockcerts</w:t>
             </w:r>
@@ -2426,7 +2557,7 @@
                 <w:b/>
                 <w:i w:val="0"/>
                 <w:color w:val="000000"/>
-                <w:sz w:val="18"/>
+                <w:sz w:val="16"/>
               </w:rPr>
               <w:t>Traditional DB</w:t>
             </w:r>
@@ -2448,7 +2579,7 @@
                 <w:b w:val="0"/>
                 <w:i w:val="0"/>
                 <w:color w:val="000000"/>
-                <w:sz w:val="18"/>
+                <w:sz w:val="16"/>
               </w:rPr>
               <w:t>Tamper Evidence</w:t>
             </w:r>
@@ -2468,7 +2599,7 @@
                 <w:b w:val="0"/>
                 <w:i w:val="0"/>
                 <w:color w:val="000000"/>
-                <w:sz w:val="18"/>
+                <w:sz w:val="16"/>
               </w:rPr>
               <w:t>Hash chaining</w:t>
             </w:r>
@@ -2488,7 +2619,7 @@
                 <w:b w:val="0"/>
                 <w:i w:val="0"/>
                 <w:color w:val="000000"/>
-                <w:sz w:val="18"/>
+                <w:sz w:val="16"/>
               </w:rPr>
               <w:t>Blockchain anchoring</w:t>
             </w:r>
@@ -2508,7 +2639,7 @@
                 <w:b w:val="0"/>
                 <w:i w:val="0"/>
                 <w:color w:val="000000"/>
-                <w:sz w:val="18"/>
+                <w:sz w:val="16"/>
               </w:rPr>
               <w:t>None</w:t>
             </w:r>
@@ -2530,7 +2661,7 @@
                 <w:b w:val="0"/>
                 <w:i w:val="0"/>
                 <w:color w:val="000000"/>
-                <w:sz w:val="18"/>
+                <w:sz w:val="16"/>
               </w:rPr>
               <w:t>Public Verifiability</w:t>
             </w:r>
@@ -2550,7 +2681,7 @@
                 <w:b w:val="0"/>
                 <w:i w:val="0"/>
                 <w:color w:val="000000"/>
-                <w:sz w:val="18"/>
+                <w:sz w:val="16"/>
               </w:rPr>
               <w:t>Yes</w:t>
             </w:r>
@@ -2570,7 +2701,7 @@
                 <w:b w:val="0"/>
                 <w:i w:val="0"/>
                 <w:color w:val="000000"/>
-                <w:sz w:val="18"/>
+                <w:sz w:val="16"/>
               </w:rPr>
               <w:t>Yes</w:t>
             </w:r>
@@ -2590,7 +2721,7 @@
                 <w:b w:val="0"/>
                 <w:i w:val="0"/>
                 <w:color w:val="000000"/>
-                <w:sz w:val="18"/>
+                <w:sz w:val="16"/>
               </w:rPr>
               <w:t>No</w:t>
             </w:r>
@@ -2612,7 +2743,7 @@
                 <w:b w:val="0"/>
                 <w:i w:val="0"/>
                 <w:color w:val="000000"/>
-                <w:sz w:val="18"/>
+                <w:sz w:val="16"/>
               </w:rPr>
               <w:t>Infrastructure Cost</w:t>
             </w:r>
@@ -2632,7 +2763,7 @@
                 <w:b w:val="0"/>
                 <w:i w:val="0"/>
                 <w:color w:val="000000"/>
-                <w:sz w:val="18"/>
+                <w:sz w:val="16"/>
               </w:rPr>
               <w:t>Low</w:t>
             </w:r>
@@ -2652,7 +2783,7 @@
                 <w:b w:val="0"/>
                 <w:i w:val="0"/>
                 <w:color w:val="000000"/>
-                <w:sz w:val="18"/>
+                <w:sz w:val="16"/>
               </w:rPr>
               <w:t>Medium</w:t>
             </w:r>
@@ -2672,7 +2803,7 @@
                 <w:b w:val="0"/>
                 <w:i w:val="0"/>
                 <w:color w:val="000000"/>
-                <w:sz w:val="18"/>
+                <w:sz w:val="16"/>
               </w:rPr>
               <w:t>Medium</w:t>
             </w:r>
@@ -2694,7 +2825,7 @@
                 <w:b w:val="0"/>
                 <w:i w:val="0"/>
                 <w:color w:val="000000"/>
-                <w:sz w:val="18"/>
+                <w:sz w:val="16"/>
               </w:rPr>
               <w:t>Setup Complexity</w:t>
             </w:r>
@@ -2714,7 +2845,7 @@
                 <w:b w:val="0"/>
                 <w:i w:val="0"/>
                 <w:color w:val="000000"/>
-                <w:sz w:val="18"/>
+                <w:sz w:val="16"/>
               </w:rPr>
               <w:t>Low</w:t>
             </w:r>
@@ -2734,7 +2865,7 @@
                 <w:b w:val="0"/>
                 <w:i w:val="0"/>
                 <w:color w:val="000000"/>
-                <w:sz w:val="18"/>
+                <w:sz w:val="16"/>
               </w:rPr>
               <w:t>High</w:t>
             </w:r>
@@ -2754,7 +2885,7 @@
                 <w:b w:val="0"/>
                 <w:i w:val="0"/>
                 <w:color w:val="000000"/>
-                <w:sz w:val="18"/>
+                <w:sz w:val="16"/>
               </w:rPr>
               <w:t>Medium</w:t>
             </w:r>
@@ -2776,7 +2907,7 @@
                 <w:b w:val="0"/>
                 <w:i w:val="0"/>
                 <w:color w:val="000000"/>
-                <w:sz w:val="18"/>
+                <w:sz w:val="16"/>
               </w:rPr>
               <w:t>Immutability</w:t>
             </w:r>
@@ -2796,7 +2927,7 @@
                 <w:b w:val="0"/>
                 <w:i w:val="0"/>
                 <w:color w:val="000000"/>
-                <w:sz w:val="18"/>
+                <w:sz w:val="16"/>
               </w:rPr>
               <w:t>Technical + Rules</w:t>
             </w:r>
@@ -2816,7 +2947,7 @@
                 <w:b w:val="0"/>
                 <w:i w:val="0"/>
                 <w:color w:val="000000"/>
-                <w:sz w:val="18"/>
+                <w:sz w:val="16"/>
               </w:rPr>
               <w:t>Consensus</w:t>
             </w:r>
@@ -2836,7 +2967,7 @@
                 <w:b w:val="0"/>
                 <w:i w:val="0"/>
                 <w:color w:val="000000"/>
-                <w:sz w:val="18"/>
+                <w:sz w:val="16"/>
               </w:rPr>
               <w:t>Policy-only</w:t>
             </w:r>
@@ -2858,7 +2989,7 @@
                 <w:b w:val="0"/>
                 <w:i w:val="0"/>
                 <w:color w:val="000000"/>
-                <w:sz w:val="18"/>
+                <w:sz w:val="16"/>
               </w:rPr>
               <w:t>Customization</w:t>
             </w:r>
@@ -2878,7 +3009,7 @@
                 <w:b w:val="0"/>
                 <w:i w:val="0"/>
                 <w:color w:val="000000"/>
-                <w:sz w:val="18"/>
+                <w:sz w:val="16"/>
               </w:rPr>
               <w:t>High</w:t>
             </w:r>
@@ -2898,7 +3029,7 @@
                 <w:b w:val="0"/>
                 <w:i w:val="0"/>
                 <w:color w:val="000000"/>
-                <w:sz w:val="18"/>
+                <w:sz w:val="16"/>
               </w:rPr>
               <w:t>Low</w:t>
             </w:r>
@@ -2918,7 +3049,7 @@
                 <w:b w:val="0"/>
                 <w:i w:val="0"/>
                 <w:color w:val="000000"/>
-                <w:sz w:val="18"/>
+                <w:sz w:val="16"/>
               </w:rPr>
               <w:t>Medium</w:t>
             </w:r>
@@ -2928,7 +3059,7 @@
     </w:tbl>
     <w:p>
       <w:pPr>
-        <w:spacing w:after="160"/>
+        <w:spacing w:after="200"/>
         <w:ind w:firstLine="0"/>
         <w:jc w:val="center"/>
       </w:pPr>
@@ -2945,9 +3076,21 @@
     </w:p>
     <w:p>
       <w:pPr>
-        <w:spacing w:after="120" w:line="240" w:lineRule="auto"/>
+        <w:sectPr>
+          <w:type w:val="continuous"/>
+          <w:pgSz w:w="11906" w:h="16838"/>
+          <w:pgMar w:top="1417" w:right="1134" w:bottom="1417" w:left="1134" w:header="720" w:footer="720" w:gutter="0"/>
+          <w:cols w:space="720" w:num="1"/>
+          <w:docGrid w:linePitch="360"/>
+        </w:sectPr>
+      </w:pPr>
+    </w:p>
+    <w:p>
+      <w:pPr>
+        <w:keepNext w:val="0"/>
+        <w:spacing w:after="100" w:line="240" w:lineRule="auto"/>
         <w:ind w:firstLine="454"/>
-        <w:jc w:val="both"/>
+        <w:jc w:val="left"/>
       </w:pPr>
       <w:r>
         <w:rPr>
@@ -2962,6 +3105,7 @@
     </w:p>
     <w:p>
       <w:pPr>
+        <w:keepNext/>
         <w:spacing w:before="200" w:after="80"/>
         <w:ind w:firstLine="0"/>
         <w:jc w:val="left"/>
@@ -2979,6 +3123,7 @@
     </w:p>
     <w:p>
       <w:pPr>
+        <w:keepNext/>
         <w:spacing w:before="200" w:after="80"/>
         <w:ind w:firstLine="0"/>
         <w:jc w:val="left"/>
@@ -2996,9 +3141,10 @@
     </w:p>
     <w:p>
       <w:pPr>
-        <w:spacing w:after="120" w:line="240" w:lineRule="auto"/>
+        <w:keepNext w:val="0"/>
+        <w:spacing w:after="100" w:line="240" w:lineRule="auto"/>
         <w:ind w:firstLine="454"/>
-        <w:jc w:val="both"/>
+        <w:jc w:val="left"/>
       </w:pPr>
       <w:r>
         <w:rPr>
@@ -3013,6 +3159,7 @@
     </w:p>
     <w:p>
       <w:pPr>
+        <w:keepNext/>
         <w:spacing w:before="200" w:after="80"/>
         <w:ind w:firstLine="0"/>
         <w:jc w:val="left"/>
@@ -3030,9 +3177,10 @@
     </w:p>
     <w:p>
       <w:pPr>
-        <w:spacing w:after="120" w:line="240" w:lineRule="auto"/>
+        <w:keepNext w:val="0"/>
+        <w:spacing w:after="100" w:line="240" w:lineRule="auto"/>
         <w:ind w:firstLine="454"/>
-        <w:jc w:val="both"/>
+        <w:jc w:val="left"/>
       </w:pPr>
       <w:r>
         <w:rPr>
@@ -3047,6 +3195,7 @@
     </w:p>
     <w:p>
       <w:pPr>
+        <w:keepNext/>
         <w:spacing w:before="200" w:after="80"/>
         <w:ind w:firstLine="0"/>
         <w:jc w:val="left"/>
@@ -3064,9 +3213,10 @@
     </w:p>
     <w:p>
       <w:pPr>
-        <w:spacing w:after="120" w:line="240" w:lineRule="auto"/>
+        <w:keepNext w:val="0"/>
+        <w:spacing w:after="100" w:line="240" w:lineRule="auto"/>
         <w:ind w:firstLine="454"/>
-        <w:jc w:val="both"/>
+        <w:jc w:val="left"/>
       </w:pPr>
       <w:r>
         <w:rPr>
@@ -3081,6 +3231,7 @@
     </w:p>
     <w:p>
       <w:pPr>
+        <w:keepNext/>
         <w:spacing w:before="200" w:after="80"/>
         <w:ind w:firstLine="0"/>
         <w:jc w:val="left"/>

</xml_diff>